<commit_message>
CV: dates on their own line for ATS, Sulfah and QSalary project lines, Adrenaline wording
Co-Authored-By: Claude Opus 5.5 <noreply@anthropic.com>
Claude-Session: https://claude.ai/code/session_01CsdgqbKDbfLszR8uS2ZC79
</commit_message>
<xml_diff>
--- a/Atef_Elsaeed_CV.docx
+++ b/Atef_Elsaeed_CV.docx
@@ -74,7 +74,7 @@
         </w:rPr>
         <w:t xml:space="preserve"> · </w:t>
       </w:r>
-      <w:hyperlink w:history="1" r:id="rIdsmsynud-ipfmuqi7nmk8w">
+      <w:hyperlink w:history="1" r:id="rIdh6ktedc51ulylwrnpjgun">
         <w:r>
           <w:rPr>
             <w:rFonts w:ascii="Calibri" w:cs="Calibri" w:eastAsia="Calibri" w:hAnsi="Calibri"/>
@@ -102,7 +102,7 @@
         </w:rPr>
         <w:t xml:space="preserve">Portfolio: </w:t>
       </w:r>
-      <w:hyperlink w:history="1" r:id="rId58-x2n2mix-8yccky_oxt">
+      <w:hyperlink w:history="1" r:id="rIdzp0gy9pecgobo-u1gj06j">
         <w:r>
           <w:rPr>
             <w:rFonts w:ascii="Calibri" w:cs="Calibri" w:eastAsia="Calibri" w:hAnsi="Calibri"/>
@@ -130,7 +130,7 @@
       <w:pPr>
         <w:spacing w:after="60"/>
       </w:pPr>
-      <w:hyperlink w:history="1" r:id="rIdkwkoojfluy8qbuygbxzl0">
+      <w:hyperlink w:history="1" r:id="rIdygvnnr7m3z_n_bq5jjjwh">
         <w:r>
           <w:rPr>
             <w:rFonts w:ascii="Calibri" w:cs="Calibri" w:eastAsia="Calibri" w:hAnsi="Calibri"/>
@@ -151,7 +151,7 @@
         </w:rPr>
         <w:t xml:space="preserve"> · </w:t>
       </w:r>
-      <w:hyperlink w:history="1" r:id="rIdorzg1qpixtz35rnam59il">
+      <w:hyperlink w:history="1" r:id="rIdljasirbkwpxxwjyqxmfkk">
         <w:r>
           <w:rPr>
             <w:rFonts w:ascii="Calibri" w:cs="Calibri" w:eastAsia="Calibri" w:hAnsi="Calibri"/>
@@ -172,7 +172,7 @@
         </w:rPr>
         <w:t xml:space="preserve"> · </w:t>
       </w:r>
-      <w:hyperlink w:history="1" r:id="rIdyeqcjx9aaaj51jm0e2q0v">
+      <w:hyperlink w:history="1" r:id="rIdqhff8g-qod7rxfqqh0fms">
         <w:r>
           <w:rPr>
             <w:rFonts w:ascii="Calibri" w:cs="Calibri" w:eastAsia="Calibri" w:hAnsi="Calibri"/>
@@ -193,7 +193,7 @@
         </w:rPr>
         <w:t xml:space="preserve"> · </w:t>
       </w:r>
-      <w:hyperlink w:history="1" r:id="rIdqwj9pdknokjuplvqofsbe">
+      <w:hyperlink w:history="1" r:id="rIdaxbvqqi1kk9a_tml7hxa-">
         <w:r>
           <w:rPr>
             <w:rFonts w:ascii="Calibri" w:cs="Calibri" w:eastAsia="Calibri" w:hAnsi="Calibri"/>
@@ -263,10 +263,7 @@
     <w:p>
       <w:pPr>
         <w:keepNext/>
-        <w:tabs>
-          <w:tab w:val="right" w:pos="9866"/>
-        </w:tabs>
-        <w:spacing w:after="20" w:before="90"/>
+        <w:spacing w:after="0" w:before="90"/>
       </w:pPr>
       <w:r>
         <w:rPr>
@@ -290,23 +287,22 @@
         </w:rPr>
         <w:t xml:space="preserve"> — Vision Dimensions</w:t>
       </w:r>
-      <w:r>
-        <w:rPr>
-          <w:rFonts w:ascii="Calibri" w:cs="Calibri" w:eastAsia="Calibri" w:hAnsi="Calibri"/>
-          <w:color w:val="0F1B2D"/>
-          <w:sz w:val="20"/>
-          <w:szCs w:val="20"/>
-        </w:rPr>
-        <w:t xml:space="preserve">	</w:t>
-      </w:r>
-      <w:r>
-        <w:rPr>
-          <w:rFonts w:ascii="Calibri" w:cs="Calibri" w:eastAsia="Calibri" w:hAnsi="Calibri"/>
-          <w:color w:val="56637A"/>
-          <w:sz w:val="19"/>
-          <w:szCs w:val="19"/>
-        </w:rPr>
-        <w:t xml:space="preserve">May 2026 – Present · Part-time</w:t>
+    </w:p>
+    <w:p>
+      <w:pPr>
+        <w:keepNext/>
+        <w:spacing w:after="20"/>
+      </w:pPr>
+      <w:r>
+        <w:rPr>
+          <w:rFonts w:ascii="Calibri" w:cs="Calibri" w:eastAsia="Calibri" w:hAnsi="Calibri"/>
+          <w:i/>
+          <w:iCs/>
+          <w:color w:val="56637A"/>
+          <w:sz w:val="19"/>
+          <w:szCs w:val="19"/>
+        </w:rPr>
+        <w:t xml:space="preserve">Part-time · May 2026 – Present</w:t>
       </w:r>
     </w:p>
     <w:p>
@@ -350,10 +346,7 @@
     <w:p>
       <w:pPr>
         <w:keepNext/>
-        <w:tabs>
-          <w:tab w:val="right" w:pos="9866"/>
-        </w:tabs>
-        <w:spacing w:after="20" w:before="90"/>
+        <w:spacing w:after="0" w:before="90"/>
       </w:pPr>
       <w:r>
         <w:rPr>
@@ -377,18 +370,17 @@
         </w:rPr>
         <w:t xml:space="preserve"> — Recapet</w:t>
       </w:r>
-      <w:r>
-        <w:rPr>
-          <w:rFonts w:ascii="Calibri" w:cs="Calibri" w:eastAsia="Calibri" w:hAnsi="Calibri"/>
-          <w:color w:val="0F1B2D"/>
-          <w:sz w:val="20"/>
-          <w:szCs w:val="20"/>
-        </w:rPr>
-        <w:t xml:space="preserve">	</w:t>
-      </w:r>
-      <w:r>
-        <w:rPr>
-          <w:rFonts w:ascii="Calibri" w:cs="Calibri" w:eastAsia="Calibri" w:hAnsi="Calibri"/>
+    </w:p>
+    <w:p>
+      <w:pPr>
+        <w:keepNext/>
+        <w:spacing w:after="20"/>
+      </w:pPr>
+      <w:r>
+        <w:rPr>
+          <w:rFonts w:ascii="Calibri" w:cs="Calibri" w:eastAsia="Calibri" w:hAnsi="Calibri"/>
+          <w:i/>
+          <w:iCs/>
           <w:color w:val="56637A"/>
           <w:sz w:val="19"/>
           <w:szCs w:val="19"/>
@@ -456,10 +448,7 @@
     <w:p>
       <w:pPr>
         <w:keepNext/>
-        <w:tabs>
-          <w:tab w:val="right" w:pos="9866"/>
-        </w:tabs>
-        <w:spacing w:after="20" w:before="90"/>
+        <w:spacing w:after="0" w:before="90"/>
       </w:pPr>
       <w:r>
         <w:rPr>
@@ -483,18 +472,17 @@
         </w:rPr>
         <w:t xml:space="preserve"> — Sulfah (Fintech)</w:t>
       </w:r>
-      <w:r>
-        <w:rPr>
-          <w:rFonts w:ascii="Calibri" w:cs="Calibri" w:eastAsia="Calibri" w:hAnsi="Calibri"/>
-          <w:color w:val="0F1B2D"/>
-          <w:sz w:val="20"/>
-          <w:szCs w:val="20"/>
-        </w:rPr>
-        <w:t xml:space="preserve">	</w:t>
-      </w:r>
-      <w:r>
-        <w:rPr>
-          <w:rFonts w:ascii="Calibri" w:cs="Calibri" w:eastAsia="Calibri" w:hAnsi="Calibri"/>
+    </w:p>
+    <w:p>
+      <w:pPr>
+        <w:keepNext/>
+        <w:spacing w:after="20"/>
+      </w:pPr>
+      <w:r>
+        <w:rPr>
+          <w:rFonts w:ascii="Calibri" w:cs="Calibri" w:eastAsia="Calibri" w:hAnsi="Calibri"/>
+          <w:i/>
+          <w:iCs/>
           <w:color w:val="56637A"/>
           <w:sz w:val="19"/>
           <w:szCs w:val="19"/>
@@ -537,7 +525,7 @@
           <w:sz w:val="20"/>
           <w:szCs w:val="20"/>
         </w:rPr>
-        <w:t xml:space="preserve">Implemented iOS Live Activities and deep linking, and improved authentication, onboarding and financial workflows</w:t>
+        <w:t xml:space="preserve">Improved authentication, onboarding and financial workflows</w:t>
       </w:r>
     </w:p>
     <w:p>
@@ -562,10 +550,7 @@
     <w:p>
       <w:pPr>
         <w:keepNext/>
-        <w:tabs>
-          <w:tab w:val="right" w:pos="9866"/>
-        </w:tabs>
-        <w:spacing w:after="20" w:before="90"/>
+        <w:spacing w:after="0" w:before="90"/>
       </w:pPr>
       <w:r>
         <w:rPr>
@@ -589,23 +574,22 @@
         </w:rPr>
         <w:t xml:space="preserve"> — GatePlus</w:t>
       </w:r>
-      <w:r>
-        <w:rPr>
-          <w:rFonts w:ascii="Calibri" w:cs="Calibri" w:eastAsia="Calibri" w:hAnsi="Calibri"/>
-          <w:color w:val="0F1B2D"/>
-          <w:sz w:val="20"/>
-          <w:szCs w:val="20"/>
-        </w:rPr>
-        <w:t xml:space="preserve">	</w:t>
-      </w:r>
-      <w:r>
-        <w:rPr>
-          <w:rFonts w:ascii="Calibri" w:cs="Calibri" w:eastAsia="Calibri" w:hAnsi="Calibri"/>
-          <w:color w:val="56637A"/>
-          <w:sz w:val="19"/>
-          <w:szCs w:val="19"/>
-        </w:rPr>
-        <w:t xml:space="preserve">Mar 2023 – Dec 2024 · Part-time</w:t>
+    </w:p>
+    <w:p>
+      <w:pPr>
+        <w:keepNext/>
+        <w:spacing w:after="20"/>
+      </w:pPr>
+      <w:r>
+        <w:rPr>
+          <w:rFonts w:ascii="Calibri" w:cs="Calibri" w:eastAsia="Calibri" w:hAnsi="Calibri"/>
+          <w:i/>
+          <w:iCs/>
+          <w:color w:val="56637A"/>
+          <w:sz w:val="19"/>
+          <w:szCs w:val="19"/>
+        </w:rPr>
+        <w:t xml:space="preserve">Part-time · Mar 2023 – Dec 2024</w:t>
       </w:r>
     </w:p>
     <w:p>
@@ -649,10 +633,7 @@
     <w:p>
       <w:pPr>
         <w:keepNext/>
-        <w:tabs>
-          <w:tab w:val="right" w:pos="9866"/>
-        </w:tabs>
-        <w:spacing w:after="20" w:before="90"/>
+        <w:spacing w:after="0" w:before="90"/>
       </w:pPr>
       <w:r>
         <w:rPr>
@@ -676,18 +657,17 @@
         </w:rPr>
         <w:t xml:space="preserve"> — I-Valley</w:t>
       </w:r>
-      <w:r>
-        <w:rPr>
-          <w:rFonts w:ascii="Calibri" w:cs="Calibri" w:eastAsia="Calibri" w:hAnsi="Calibri"/>
-          <w:color w:val="0F1B2D"/>
-          <w:sz w:val="20"/>
-          <w:szCs w:val="20"/>
-        </w:rPr>
-        <w:t xml:space="preserve">	</w:t>
-      </w:r>
-      <w:r>
-        <w:rPr>
-          <w:rFonts w:ascii="Calibri" w:cs="Calibri" w:eastAsia="Calibri" w:hAnsi="Calibri"/>
+    </w:p>
+    <w:p>
+      <w:pPr>
+        <w:keepNext/>
+        <w:spacing w:after="20"/>
+      </w:pPr>
+      <w:r>
+        <w:rPr>
+          <w:rFonts w:ascii="Calibri" w:cs="Calibri" w:eastAsia="Calibri" w:hAnsi="Calibri"/>
+          <w:i/>
+          <w:iCs/>
           <w:color w:val="56637A"/>
           <w:sz w:val="19"/>
           <w:szCs w:val="19"/>
@@ -717,10 +697,7 @@
     <w:p>
       <w:pPr>
         <w:keepNext/>
-        <w:tabs>
-          <w:tab w:val="right" w:pos="9866"/>
-        </w:tabs>
-        <w:spacing w:after="20" w:before="90"/>
+        <w:spacing w:after="0" w:before="90"/>
       </w:pPr>
       <w:r>
         <w:rPr>
@@ -744,23 +721,22 @@
         </w:rPr>
         <w:t xml:space="preserve"> — Takamol</w:t>
       </w:r>
-      <w:r>
-        <w:rPr>
-          <w:rFonts w:ascii="Calibri" w:cs="Calibri" w:eastAsia="Calibri" w:hAnsi="Calibri"/>
-          <w:color w:val="0F1B2D"/>
-          <w:sz w:val="20"/>
-          <w:szCs w:val="20"/>
-        </w:rPr>
-        <w:t xml:space="preserve">	</w:t>
-      </w:r>
-      <w:r>
-        <w:rPr>
-          <w:rFonts w:ascii="Calibri" w:cs="Calibri" w:eastAsia="Calibri" w:hAnsi="Calibri"/>
-          <w:color w:val="56637A"/>
-          <w:sz w:val="19"/>
-          <w:szCs w:val="19"/>
-        </w:rPr>
-        <w:t xml:space="preserve">Feb 2022 – Jul 2023 · Part-time</w:t>
+    </w:p>
+    <w:p>
+      <w:pPr>
+        <w:keepNext/>
+        <w:spacing w:after="20"/>
+      </w:pPr>
+      <w:r>
+        <w:rPr>
+          <w:rFonts w:ascii="Calibri" w:cs="Calibri" w:eastAsia="Calibri" w:hAnsi="Calibri"/>
+          <w:i/>
+          <w:iCs/>
+          <w:color w:val="56637A"/>
+          <w:sz w:val="19"/>
+          <w:szCs w:val="19"/>
+        </w:rPr>
+        <w:t xml:space="preserve">Part-time · Feb 2022 – Jul 2023</w:t>
       </w:r>
     </w:p>
     <w:p>
@@ -785,10 +761,7 @@
     <w:p>
       <w:pPr>
         <w:keepNext/>
-        <w:tabs>
-          <w:tab w:val="right" w:pos="9866"/>
-        </w:tabs>
-        <w:spacing w:after="20" w:before="90"/>
+        <w:spacing w:after="0" w:before="90"/>
       </w:pPr>
       <w:r>
         <w:rPr>
@@ -812,18 +785,17 @@
         </w:rPr>
         <w:t xml:space="preserve"> — SD Solutions</w:t>
       </w:r>
-      <w:r>
-        <w:rPr>
-          <w:rFonts w:ascii="Calibri" w:cs="Calibri" w:eastAsia="Calibri" w:hAnsi="Calibri"/>
-          <w:color w:val="0F1B2D"/>
-          <w:sz w:val="20"/>
-          <w:szCs w:val="20"/>
-        </w:rPr>
-        <w:t xml:space="preserve">	</w:t>
-      </w:r>
-      <w:r>
-        <w:rPr>
-          <w:rFonts w:ascii="Calibri" w:cs="Calibri" w:eastAsia="Calibri" w:hAnsi="Calibri"/>
+    </w:p>
+    <w:p>
+      <w:pPr>
+        <w:keepNext/>
+        <w:spacing w:after="20"/>
+      </w:pPr>
+      <w:r>
+        <w:rPr>
+          <w:rFonts w:ascii="Calibri" w:cs="Calibri" w:eastAsia="Calibri" w:hAnsi="Calibri"/>
+          <w:i/>
+          <w:iCs/>
           <w:color w:val="56637A"/>
           <w:sz w:val="19"/>
           <w:szCs w:val="19"/>
@@ -873,10 +845,7 @@
     <w:p>
       <w:pPr>
         <w:keepNext/>
-        <w:tabs>
-          <w:tab w:val="right" w:pos="9866"/>
-        </w:tabs>
-        <w:spacing w:after="20" w:before="90"/>
+        <w:spacing w:after="0" w:before="90"/>
       </w:pPr>
       <w:r>
         <w:rPr>
@@ -900,18 +869,17 @@
         </w:rPr>
         <w:t xml:space="preserve"> — Dikirnis On</w:t>
       </w:r>
-      <w:r>
-        <w:rPr>
-          <w:rFonts w:ascii="Calibri" w:cs="Calibri" w:eastAsia="Calibri" w:hAnsi="Calibri"/>
-          <w:color w:val="0F1B2D"/>
-          <w:sz w:val="20"/>
-          <w:szCs w:val="20"/>
-        </w:rPr>
-        <w:t xml:space="preserve">	</w:t>
-      </w:r>
-      <w:r>
-        <w:rPr>
-          <w:rFonts w:ascii="Calibri" w:cs="Calibri" w:eastAsia="Calibri" w:hAnsi="Calibri"/>
+    </w:p>
+    <w:p>
+      <w:pPr>
+        <w:keepNext/>
+        <w:spacing w:after="20"/>
+      </w:pPr>
+      <w:r>
+        <w:rPr>
+          <w:rFonts w:ascii="Calibri" w:cs="Calibri" w:eastAsia="Calibri" w:hAnsi="Calibri"/>
+          <w:i/>
+          <w:iCs/>
           <w:color w:val="56637A"/>
           <w:sz w:val="19"/>
           <w:szCs w:val="19"/>
@@ -1042,7 +1010,7 @@
         </w:rPr>
         <w:t xml:space="preserve"> · </w:t>
       </w:r>
-      <w:hyperlink w:history="1" r:id="rIdpiz8l8fgf5nkyig8ruywl">
+      <w:hyperlink w:history="1" r:id="rIdhu1jwd_bwyobvmlcql2az">
         <w:r>
           <w:rPr>
             <w:rFonts w:ascii="Calibri" w:cs="Calibri" w:eastAsia="Calibri" w:hAnsi="Calibri"/>
@@ -1063,7 +1031,7 @@
         </w:rPr>
         <w:t xml:space="preserve"> · </w:t>
       </w:r>
-      <w:hyperlink w:history="1" r:id="rIdrgafsj1pga2lfgfpbfrz8">
+      <w:hyperlink w:history="1" r:id="rIdsvbyzkmsisiggqhqyatq0">
         <w:r>
           <w:rPr>
             <w:rFonts w:ascii="Calibri" w:cs="Calibri" w:eastAsia="Calibri" w:hAnsi="Calibri"/>
@@ -1079,10 +1047,7 @@
     <w:p>
       <w:pPr>
         <w:keepNext/>
-        <w:tabs>
-          <w:tab w:val="right" w:pos="9866"/>
-        </w:tabs>
-        <w:spacing w:after="20" w:before="90"/>
+        <w:spacing w:after="0" w:before="90"/>
       </w:pPr>
       <w:r>
         <w:rPr>
@@ -1106,18 +1071,17 @@
         </w:rPr>
         <w:t xml:space="preserve"> — Adrenaline Platform</w:t>
       </w:r>
-      <w:r>
-        <w:rPr>
-          <w:rFonts w:ascii="Calibri" w:cs="Calibri" w:eastAsia="Calibri" w:hAnsi="Calibri"/>
-          <w:color w:val="0F1B2D"/>
-          <w:sz w:val="20"/>
-          <w:szCs w:val="20"/>
-        </w:rPr>
-        <w:t xml:space="preserve">	</w:t>
-      </w:r>
-      <w:r>
-        <w:rPr>
-          <w:rFonts w:ascii="Calibri" w:cs="Calibri" w:eastAsia="Calibri" w:hAnsi="Calibri"/>
+    </w:p>
+    <w:p>
+      <w:pPr>
+        <w:keepNext/>
+        <w:spacing w:after="20"/>
+      </w:pPr>
+      <w:r>
+        <w:rPr>
+          <w:rFonts w:ascii="Calibri" w:cs="Calibri" w:eastAsia="Calibri" w:hAnsi="Calibri"/>
+          <w:i/>
+          <w:iCs/>
           <w:color w:val="56637A"/>
           <w:sz w:val="19"/>
           <w:szCs w:val="19"/>
@@ -1141,7 +1105,7 @@
           <w:sz w:val="20"/>
           <w:szCs w:val="20"/>
         </w:rPr>
-        <w:t xml:space="preserve">Lead the cross-functional tech team (Mobile, Backend, DevOps) delivering mobile apps, web platform and admin dashboard</w:t>
+        <w:t xml:space="preserve">Lead a cross-functional team across Mobile, Backend and DevOps, delivering mobile apps, a web platform and an admin dashboard</w:t>
       </w:r>
     </w:p>
     <w:p>
@@ -1160,7 +1124,7 @@
           <w:sz w:val="20"/>
           <w:szCs w:val="20"/>
         </w:rPr>
-        <w:t xml:space="preserve">Run sprint planning, task distribution and the full release lifecycle; improved deployment workflows and stability</w:t>
+        <w:t xml:space="preserve">Manage sprint planning, task allocation and release coordination; improve deployment workflows and system stability</w:t>
       </w:r>
     </w:p>
     <w:p>
@@ -1198,7 +1162,7 @@
         </w:rPr>
         <w:t xml:space="preserve">Full case studies with technical decisions: </w:t>
       </w:r>
-      <w:hyperlink w:history="1" r:id="rIdkzpbzph5r64imsru8pr8i">
+      <w:hyperlink w:history="1" r:id="rIdqvunucxlfexka2yrub447">
         <w:r>
           <w:rPr>
             <w:rFonts w:ascii="Calibri" w:cs="Calibri" w:eastAsia="Calibri" w:hAnsi="Calibri"/>
@@ -1216,9 +1180,6 @@
     <w:p>
       <w:pPr>
         <w:keepNext/>
-        <w:tabs>
-          <w:tab w:val="right" w:pos="9866"/>
-        </w:tabs>
         <w:spacing w:after="20" w:before="90"/>
       </w:pPr>
       <w:r>
@@ -1246,13 +1207,13 @@
       <w:r>
         <w:rPr>
           <w:rFonts w:ascii="Calibri" w:cs="Calibri" w:eastAsia="Calibri" w:hAnsi="Calibri"/>
-          <w:color w:val="0F1B2D"/>
-          <w:sz w:val="20"/>
-          <w:szCs w:val="20"/>
-        </w:rPr>
-        <w:t xml:space="preserve">	</w:t>
-      </w:r>
-      <w:hyperlink w:history="1" r:id="rIdk2ek3o2c8fkcxykfk4yhk">
+          <w:color w:val="56637A"/>
+          <w:sz w:val="19"/>
+          <w:szCs w:val="19"/>
+        </w:rPr>
+        <w:t xml:space="preserve"> · </w:t>
+      </w:r>
+      <w:hyperlink w:history="1" r:id="rIdeedcgz70rscp2ptuqa760">
         <w:r>
           <w:rPr>
             <w:rFonts w:ascii="Calibri" w:cs="Calibri" w:eastAsia="Calibri" w:hAnsi="Calibri"/>
@@ -1273,7 +1234,7 @@
         </w:rPr>
         <w:t xml:space="preserve"> · </w:t>
       </w:r>
-      <w:hyperlink w:history="1" r:id="rIdshidke0bcmtcza9sioibj">
+      <w:hyperlink w:history="1" r:id="rIdhksrklqi_8m8fuk_nsu4q">
         <w:r>
           <w:rPr>
             <w:rFonts w:ascii="Calibri" w:cs="Calibri" w:eastAsia="Calibri" w:hAnsi="Calibri"/>
@@ -1288,10 +1249,26 @@
     </w:p>
     <w:p>
       <w:pPr>
+        <w:pStyle w:val="ListParagraph"/>
+        <w:numPr>
+          <w:ilvl w:val="0"/>
+          <w:numId w:val="2"/>
+        </w:numPr>
+        <w:spacing w:after="20"/>
+      </w:pPr>
+      <w:r>
+        <w:rPr>
+          <w:rFonts w:ascii="Calibri" w:cs="Calibri" w:eastAsia="Calibri" w:hAnsi="Calibri"/>
+          <w:color w:val="0F1B2D"/>
+          <w:sz w:val="20"/>
+          <w:szCs w:val="20"/>
+        </w:rPr>
+        <w:t xml:space="preserve">Implemented iOS Live Activities and deep linking</w:t>
+      </w:r>
+    </w:p>
+    <w:p>
+      <w:pPr>
         <w:keepNext/>
-        <w:tabs>
-          <w:tab w:val="right" w:pos="9866"/>
-        </w:tabs>
         <w:spacing w:after="20" w:before="90"/>
       </w:pPr>
       <w:r>
@@ -1319,13 +1296,13 @@
       <w:r>
         <w:rPr>
           <w:rFonts w:ascii="Calibri" w:cs="Calibri" w:eastAsia="Calibri" w:hAnsi="Calibri"/>
-          <w:color w:val="0F1B2D"/>
-          <w:sz w:val="20"/>
-          <w:szCs w:val="20"/>
-        </w:rPr>
-        <w:t xml:space="preserve">	</w:t>
-      </w:r>
-      <w:hyperlink w:history="1" r:id="rIdxabl5ja1ghppzsgojzeed">
+          <w:color w:val="56637A"/>
+          <w:sz w:val="19"/>
+          <w:szCs w:val="19"/>
+        </w:rPr>
+        <w:t xml:space="preserve"> · </w:t>
+      </w:r>
+      <w:hyperlink w:history="1" r:id="rId8b7lhznptaqmy9ysier61">
         <w:r>
           <w:rPr>
             <w:rFonts w:ascii="Calibri" w:cs="Calibri" w:eastAsia="Calibri" w:hAnsi="Calibri"/>
@@ -1346,7 +1323,7 @@
         </w:rPr>
         <w:t xml:space="preserve"> · </w:t>
       </w:r>
-      <w:hyperlink w:history="1" r:id="rId0sg8vipz5s71ky25s0ujy">
+      <w:hyperlink w:history="1" r:id="rIdp-zzhujgvo1mttyb2wixx">
         <w:r>
           <w:rPr>
             <w:rFonts w:ascii="Calibri" w:cs="Calibri" w:eastAsia="Calibri" w:hAnsi="Calibri"/>
@@ -1375,15 +1352,12 @@
           <w:sz w:val="20"/>
           <w:szCs w:val="20"/>
         </w:rPr>
-        <w:t xml:space="preserve">Built the majority of the app's core features and payment integrations; improved performance and UX</w:t>
+        <w:t xml:space="preserve">Built core app features and integrated payment and financial APIs, with a focus on performance and user experience</w:t>
       </w:r>
     </w:p>
     <w:p>
       <w:pPr>
         <w:keepNext/>
-        <w:tabs>
-          <w:tab w:val="right" w:pos="9866"/>
-        </w:tabs>
         <w:spacing w:after="20" w:before="90"/>
       </w:pPr>
       <w:r>
@@ -1411,13 +1385,13 @@
       <w:r>
         <w:rPr>
           <w:rFonts w:ascii="Calibri" w:cs="Calibri" w:eastAsia="Calibri" w:hAnsi="Calibri"/>
-          <w:color w:val="0F1B2D"/>
-          <w:sz w:val="20"/>
-          <w:szCs w:val="20"/>
-        </w:rPr>
-        <w:t xml:space="preserve">	</w:t>
-      </w:r>
-      <w:hyperlink w:history="1" r:id="rId9l_jojtqgvrpwul1ijxib">
+          <w:color w:val="56637A"/>
+          <w:sz w:val="19"/>
+          <w:szCs w:val="19"/>
+        </w:rPr>
+        <w:t xml:space="preserve"> · </w:t>
+      </w:r>
+      <w:hyperlink w:history="1" r:id="rIdlno1ammivrs_24cg29lxl">
         <w:r>
           <w:rPr>
             <w:rFonts w:ascii="Calibri" w:cs="Calibri" w:eastAsia="Calibri" w:hAnsi="Calibri"/>
@@ -1438,7 +1412,7 @@
         </w:rPr>
         <w:t xml:space="preserve"> · </w:t>
       </w:r>
-      <w:hyperlink w:history="1" r:id="rIdst8i8bpviphblm1e8yzki">
+      <w:hyperlink w:history="1" r:id="rIdcb1otensam-ko4cvi_7yr">
         <w:r>
           <w:rPr>
             <w:rFonts w:ascii="Calibri" w:cs="Calibri" w:eastAsia="Calibri" w:hAnsi="Calibri"/>
@@ -1531,9 +1505,6 @@
     <w:p>
       <w:pPr>
         <w:keepNext/>
-        <w:tabs>
-          <w:tab w:val="right" w:pos="9866"/>
-        </w:tabs>
         <w:spacing w:after="20" w:before="90"/>
       </w:pPr>
       <w:r>
@@ -1561,13 +1532,13 @@
       <w:r>
         <w:rPr>
           <w:rFonts w:ascii="Calibri" w:cs="Calibri" w:eastAsia="Calibri" w:hAnsi="Calibri"/>
-          <w:color w:val="0F1B2D"/>
-          <w:sz w:val="20"/>
-          <w:szCs w:val="20"/>
-        </w:rPr>
-        <w:t xml:space="preserve">	</w:t>
-      </w:r>
-      <w:hyperlink w:history="1" r:id="rIdljlopmvqque2fqbhlywj3">
+          <w:color w:val="56637A"/>
+          <w:sz w:val="19"/>
+          <w:szCs w:val="19"/>
+        </w:rPr>
+        <w:t xml:space="preserve"> · </w:t>
+      </w:r>
+      <w:hyperlink w:history="1" r:id="rIdn8is0j0s1kzt3guo6myq5">
         <w:r>
           <w:rPr>
             <w:rFonts w:ascii="Calibri" w:cs="Calibri" w:eastAsia="Calibri" w:hAnsi="Calibri"/>
@@ -1588,7 +1559,7 @@
         </w:rPr>
         <w:t xml:space="preserve"> · </w:t>
       </w:r>
-      <w:hyperlink w:history="1" r:id="rIdvu1tartg5gksjrf4mh75d">
+      <w:hyperlink w:history="1" r:id="rIdulvzze9julj7xppppm2hi">
         <w:r>
           <w:rPr>
             <w:rFonts w:ascii="Calibri" w:cs="Calibri" w:eastAsia="Calibri" w:hAnsi="Calibri"/>
@@ -1623,9 +1594,6 @@
     <w:p>
       <w:pPr>
         <w:keepNext/>
-        <w:tabs>
-          <w:tab w:val="right" w:pos="9866"/>
-        </w:tabs>
         <w:spacing w:after="20" w:before="90"/>
       </w:pPr>
       <w:r>
@@ -1653,13 +1621,13 @@
       <w:r>
         <w:rPr>
           <w:rFonts w:ascii="Calibri" w:cs="Calibri" w:eastAsia="Calibri" w:hAnsi="Calibri"/>
-          <w:color w:val="0F1B2D"/>
-          <w:sz w:val="20"/>
-          <w:szCs w:val="20"/>
-        </w:rPr>
-        <w:t xml:space="preserve">	</w:t>
-      </w:r>
-      <w:hyperlink w:history="1" r:id="rIdhouudbvjp5hzkox--uosk">
+          <w:color w:val="56637A"/>
+          <w:sz w:val="19"/>
+          <w:szCs w:val="19"/>
+        </w:rPr>
+        <w:t xml:space="preserve"> · </w:t>
+      </w:r>
+      <w:hyperlink w:history="1" r:id="rIdp3fasamixl7qfi2f1dgg4">
         <w:r>
           <w:rPr>
             <w:rFonts w:ascii="Calibri" w:cs="Calibri" w:eastAsia="Calibri" w:hAnsi="Calibri"/>
@@ -1680,7 +1648,7 @@
         </w:rPr>
         <w:t xml:space="preserve"> · </w:t>
       </w:r>
-      <w:hyperlink w:history="1" r:id="rIdywai53q-nqokgjbqv35tf">
+      <w:hyperlink w:history="1" r:id="rId-p4hu_jj8_f62wxlccixf">
         <w:r>
           <w:rPr>
             <w:rFonts w:ascii="Calibri" w:cs="Calibri" w:eastAsia="Calibri" w:hAnsi="Calibri"/>
@@ -1715,9 +1683,6 @@
     <w:p>
       <w:pPr>
         <w:keepNext/>
-        <w:tabs>
-          <w:tab w:val="right" w:pos="9866"/>
-        </w:tabs>
         <w:spacing w:after="20" w:before="90"/>
       </w:pPr>
       <w:r>
@@ -1745,13 +1710,13 @@
       <w:r>
         <w:rPr>
           <w:rFonts w:ascii="Calibri" w:cs="Calibri" w:eastAsia="Calibri" w:hAnsi="Calibri"/>
-          <w:color w:val="0F1B2D"/>
-          <w:sz w:val="20"/>
-          <w:szCs w:val="20"/>
-        </w:rPr>
-        <w:t xml:space="preserve">	</w:t>
-      </w:r>
-      <w:hyperlink w:history="1" r:id="rIdsdpy5jruvbx5ebsdtoxdo">
+          <w:color w:val="56637A"/>
+          <w:sz w:val="19"/>
+          <w:szCs w:val="19"/>
+        </w:rPr>
+        <w:t xml:space="preserve"> · </w:t>
+      </w:r>
+      <w:hyperlink w:history="1" r:id="rIdgintn3aljtz2gmdplyz2d">
         <w:r>
           <w:rPr>
             <w:rFonts w:ascii="Calibri" w:cs="Calibri" w:eastAsia="Calibri" w:hAnsi="Calibri"/>
@@ -1772,7 +1737,7 @@
         </w:rPr>
         <w:t xml:space="preserve"> · </w:t>
       </w:r>
-      <w:hyperlink w:history="1" r:id="rIdlbxpliofxqh5z2rjjmbhe">
+      <w:hyperlink w:history="1" r:id="rIdrabwwvcuvxt1ffzmtgftn">
         <w:r>
           <w:rPr>
             <w:rFonts w:ascii="Calibri" w:cs="Calibri" w:eastAsia="Calibri" w:hAnsi="Calibri"/>

</xml_diff>

<commit_message>
CV: Live Activities back in Sulfah experience, summary and Miqat wording
Co-Authored-By: Claude Opus 5.5 <noreply@anthropic.com>
Claude-Session: https://claude.ai/code/session_01CsdgqbKDbfLszR8uS2ZC79
</commit_message>
<xml_diff>
--- a/Atef_Elsaeed_CV.docx
+++ b/Atef_Elsaeed_CV.docx
@@ -74,7 +74,7 @@
         </w:rPr>
         <w:t xml:space="preserve"> · </w:t>
       </w:r>
-      <w:hyperlink w:history="1" r:id="rIdh6ktedc51ulylwrnpjgun">
+      <w:hyperlink w:history="1" r:id="rId0vj2n4umzz12wolo9uo97">
         <w:r>
           <w:rPr>
             <w:rFonts w:ascii="Calibri" w:cs="Calibri" w:eastAsia="Calibri" w:hAnsi="Calibri"/>
@@ -102,7 +102,7 @@
         </w:rPr>
         <w:t xml:space="preserve">Portfolio: </w:t>
       </w:r>
-      <w:hyperlink w:history="1" r:id="rIdzp0gy9pecgobo-u1gj06j">
+      <w:hyperlink w:history="1" r:id="rIdjkrmfpigwufbtldatl7la">
         <w:r>
           <w:rPr>
             <w:rFonts w:ascii="Calibri" w:cs="Calibri" w:eastAsia="Calibri" w:hAnsi="Calibri"/>
@@ -130,7 +130,7 @@
       <w:pPr>
         <w:spacing w:after="60"/>
       </w:pPr>
-      <w:hyperlink w:history="1" r:id="rIdygvnnr7m3z_n_bq5jjjwh">
+      <w:hyperlink w:history="1" r:id="rIdcdukapus1rxregkpwcgw5">
         <w:r>
           <w:rPr>
             <w:rFonts w:ascii="Calibri" w:cs="Calibri" w:eastAsia="Calibri" w:hAnsi="Calibri"/>
@@ -151,7 +151,7 @@
         </w:rPr>
         <w:t xml:space="preserve"> · </w:t>
       </w:r>
-      <w:hyperlink w:history="1" r:id="rIdljasirbkwpxxwjyqxmfkk">
+      <w:hyperlink w:history="1" r:id="rIdxs5lthp524mio2ugc0beo">
         <w:r>
           <w:rPr>
             <w:rFonts w:ascii="Calibri" w:cs="Calibri" w:eastAsia="Calibri" w:hAnsi="Calibri"/>
@@ -172,7 +172,7 @@
         </w:rPr>
         <w:t xml:space="preserve"> · </w:t>
       </w:r>
-      <w:hyperlink w:history="1" r:id="rIdqhff8g-qod7rxfqqh0fms">
+      <w:hyperlink w:history="1" r:id="rIdp8njm6ztgw9svn_ulx2zx">
         <w:r>
           <w:rPr>
             <w:rFonts w:ascii="Calibri" w:cs="Calibri" w:eastAsia="Calibri" w:hAnsi="Calibri"/>
@@ -193,7 +193,7 @@
         </w:rPr>
         <w:t xml:space="preserve"> · </w:t>
       </w:r>
-      <w:hyperlink w:history="1" r:id="rIdaxbvqqi1kk9a_tml7hxa-">
+      <w:hyperlink w:history="1" r:id="rIddgb78_cuq1sresngnzxkh">
         <w:r>
           <w:rPr>
             <w:rFonts w:ascii="Calibri" w:cs="Calibri" w:eastAsia="Calibri" w:hAnsi="Calibri"/>
@@ -237,7 +237,7 @@
           <w:sz w:val="20"/>
           <w:szCs w:val="20"/>
         </w:rPr>
-        <w:t xml:space="preserve">Senior Flutter Developer with 5+ years building and maintaining production mobile apps across fintech, recruitment, government and consumer products, including a lending app with 500K+ downloads. Strong expertise in Flutter, Dart, Clean Architecture, Bloc and Riverpod, with hands-on experience in financial integrations, performance optimization, production monitoring and App Store / Google Play releases. Experienced in owning mobile apps end to end, from architecture to deployment and maintenance; co-founded and built a local marketplace that reached 2,500+ users and 500+ registered businesses within five months of launch.</w:t>
+        <w:t xml:space="preserve">Senior Flutter Developer with 5+ years of experience building and maintaining production mobile apps across fintech, recruitment, government and consumer products, including a lending app with 500K+ downloads. Strong expertise in Flutter, Dart, Clean Architecture, Bloc and Riverpod, with hands-on experience in financial integrations, performance optimization, production monitoring and App Store / Google Play releases. Experienced in owning mobile apps end to end, from architecture to deployment and maintenance; co-founded and built a local marketplace that reached 2,500+ users and 500+ registered businesses within five months of launch.</w:t>
       </w:r>
     </w:p>
     <w:p>
@@ -506,7 +506,7 @@
           <w:sz w:val="20"/>
           <w:szCs w:val="20"/>
         </w:rPr>
-        <w:t xml:space="preserve">Developed and maintained features for a lending app with 500K+ downloads</w:t>
+        <w:t xml:space="preserve">Developed and maintained features for a lending app with 500K+ downloads, including iOS Live Activities and deep linking</w:t>
       </w:r>
     </w:p>
     <w:p>
@@ -525,7 +525,52 @@
           <w:sz w:val="20"/>
           <w:szCs w:val="20"/>
         </w:rPr>
-        <w:t xml:space="preserve">Improved authentication, onboarding and financial workflows</w:t>
+        <w:t xml:space="preserve">Improved authentication, onboarding and financial workflows, while addressing performance, stability and sensitive-data handling</w:t>
+      </w:r>
+    </w:p>
+    <w:p>
+      <w:pPr>
+        <w:keepNext/>
+        <w:spacing w:after="0" w:before="90"/>
+      </w:pPr>
+      <w:r>
+        <w:rPr>
+          <w:rFonts w:ascii="Calibri" w:cs="Calibri" w:eastAsia="Calibri" w:hAnsi="Calibri"/>
+          <w:b/>
+          <w:bCs/>
+          <w:color w:val="0F1B2D"/>
+          <w:sz w:val="21"/>
+          <w:szCs w:val="21"/>
+        </w:rPr>
+        <w:t xml:space="preserve">Software Team Lead</w:t>
+      </w:r>
+      <w:r>
+        <w:rPr>
+          <w:rFonts w:ascii="Calibri" w:cs="Calibri" w:eastAsia="Calibri" w:hAnsi="Calibri"/>
+          <w:b/>
+          <w:bCs/>
+          <w:color w:val="56637A"/>
+          <w:sz w:val="21"/>
+          <w:szCs w:val="21"/>
+        </w:rPr>
+        <w:t xml:space="preserve"> — GatePlus</w:t>
+      </w:r>
+    </w:p>
+    <w:p>
+      <w:pPr>
+        <w:keepNext/>
+        <w:spacing w:after="20"/>
+      </w:pPr>
+      <w:r>
+        <w:rPr>
+          <w:rFonts w:ascii="Calibri" w:cs="Calibri" w:eastAsia="Calibri" w:hAnsi="Calibri"/>
+          <w:i/>
+          <w:iCs/>
+          <w:color w:val="56637A"/>
+          <w:sz w:val="19"/>
+          <w:szCs w:val="19"/>
+        </w:rPr>
+        <w:t xml:space="preserve">Part-time · Mar 2023 – Dec 2024</w:t>
       </w:r>
     </w:p>
     <w:p>
@@ -544,52 +589,7 @@
           <w:sz w:val="20"/>
           <w:szCs w:val="20"/>
         </w:rPr>
-        <w:t xml:space="preserve">Handled sensitive user data securely and addressed performance and stability issues across the app</w:t>
-      </w:r>
-    </w:p>
-    <w:p>
-      <w:pPr>
-        <w:keepNext/>
-        <w:spacing w:after="0" w:before="90"/>
-      </w:pPr>
-      <w:r>
-        <w:rPr>
-          <w:rFonts w:ascii="Calibri" w:cs="Calibri" w:eastAsia="Calibri" w:hAnsi="Calibri"/>
-          <w:b/>
-          <w:bCs/>
-          <w:color w:val="0F1B2D"/>
-          <w:sz w:val="21"/>
-          <w:szCs w:val="21"/>
-        </w:rPr>
-        <w:t xml:space="preserve">Software Team Lead</w:t>
-      </w:r>
-      <w:r>
-        <w:rPr>
-          <w:rFonts w:ascii="Calibri" w:cs="Calibri" w:eastAsia="Calibri" w:hAnsi="Calibri"/>
-          <w:b/>
-          <w:bCs/>
-          <w:color w:val="56637A"/>
-          <w:sz w:val="21"/>
-          <w:szCs w:val="21"/>
-        </w:rPr>
-        <w:t xml:space="preserve"> — GatePlus</w:t>
-      </w:r>
-    </w:p>
-    <w:p>
-      <w:pPr>
-        <w:keepNext/>
-        <w:spacing w:after="20"/>
-      </w:pPr>
-      <w:r>
-        <w:rPr>
-          <w:rFonts w:ascii="Calibri" w:cs="Calibri" w:eastAsia="Calibri" w:hAnsi="Calibri"/>
-          <w:i/>
-          <w:iCs/>
-          <w:color w:val="56637A"/>
-          <w:sz w:val="19"/>
-          <w:szCs w:val="19"/>
-        </w:rPr>
-        <w:t xml:space="preserve">Part-time · Mar 2023 – Dec 2024</w:t>
+        <w:t xml:space="preserve">Built and led a team of 10+ engineers delivering a recruitment system used by multiple companies</w:t>
       </w:r>
     </w:p>
     <w:p>
@@ -608,7 +608,52 @@
           <w:sz w:val="20"/>
           <w:szCs w:val="20"/>
         </w:rPr>
-        <w:t xml:space="preserve">Built and led a team of 10+ engineers delivering a recruitment system used by multiple companies</w:t>
+        <w:t xml:space="preserve">Owned architecture decisions, sprint planning, code reviews and QA processes</w:t>
+      </w:r>
+    </w:p>
+    <w:p>
+      <w:pPr>
+        <w:keepNext/>
+        <w:spacing w:after="0" w:before="90"/>
+      </w:pPr>
+      <w:r>
+        <w:rPr>
+          <w:rFonts w:ascii="Calibri" w:cs="Calibri" w:eastAsia="Calibri" w:hAnsi="Calibri"/>
+          <w:b/>
+          <w:bCs/>
+          <w:color w:val="0F1B2D"/>
+          <w:sz w:val="21"/>
+          <w:szCs w:val="21"/>
+        </w:rPr>
+        <w:t xml:space="preserve">Mobile Developer</w:t>
+      </w:r>
+      <w:r>
+        <w:rPr>
+          <w:rFonts w:ascii="Calibri" w:cs="Calibri" w:eastAsia="Calibri" w:hAnsi="Calibri"/>
+          <w:b/>
+          <w:bCs/>
+          <w:color w:val="56637A"/>
+          <w:sz w:val="21"/>
+          <w:szCs w:val="21"/>
+        </w:rPr>
+        <w:t xml:space="preserve"> — I-Valley</w:t>
+      </w:r>
+    </w:p>
+    <w:p>
+      <w:pPr>
+        <w:keepNext/>
+        <w:spacing w:after="20"/>
+      </w:pPr>
+      <w:r>
+        <w:rPr>
+          <w:rFonts w:ascii="Calibri" w:cs="Calibri" w:eastAsia="Calibri" w:hAnsi="Calibri"/>
+          <w:i/>
+          <w:iCs/>
+          <w:color w:val="56637A"/>
+          <w:sz w:val="19"/>
+          <w:szCs w:val="19"/>
+        </w:rPr>
+        <w:t xml:space="preserve">Dec 2022 – Nov 2023</w:t>
       </w:r>
     </w:p>
     <w:p>
@@ -627,7 +672,7 @@
           <w:sz w:val="20"/>
           <w:szCs w:val="20"/>
         </w:rPr>
-        <w:t xml:space="preserve">Owned architecture decisions, sprint planning, code reviews and QA processes</w:t>
+        <w:t xml:space="preserve">Built production apps across multiple domains using Clean Architecture</w:t>
       </w:r>
     </w:p>
     <w:p>
@@ -644,18 +689,18 @@
           <w:sz w:val="21"/>
           <w:szCs w:val="21"/>
         </w:rPr>
-        <w:t xml:space="preserve">Mobile Developer</w:t>
-      </w:r>
-      <w:r>
-        <w:rPr>
-          <w:rFonts w:ascii="Calibri" w:cs="Calibri" w:eastAsia="Calibri" w:hAnsi="Calibri"/>
-          <w:b/>
-          <w:bCs/>
-          <w:color w:val="56637A"/>
-          <w:sz w:val="21"/>
-          <w:szCs w:val="21"/>
-        </w:rPr>
-        <w:t xml:space="preserve"> — I-Valley</w:t>
+        <w:t xml:space="preserve">Flutter Developer</w:t>
+      </w:r>
+      <w:r>
+        <w:rPr>
+          <w:rFonts w:ascii="Calibri" w:cs="Calibri" w:eastAsia="Calibri" w:hAnsi="Calibri"/>
+          <w:b/>
+          <w:bCs/>
+          <w:color w:val="56637A"/>
+          <w:sz w:val="21"/>
+          <w:szCs w:val="21"/>
+        </w:rPr>
+        <w:t xml:space="preserve"> — Takamol</w:t>
       </w:r>
     </w:p>
     <w:p>
@@ -672,7 +717,7 @@
           <w:sz w:val="19"/>
           <w:szCs w:val="19"/>
         </w:rPr>
-        <w:t xml:space="preserve">Dec 2022 – Nov 2023</w:t>
+        <w:t xml:space="preserve">Part-time · Feb 2022 – Jul 2023</w:t>
       </w:r>
     </w:p>
     <w:p>
@@ -691,7 +736,7 @@
           <w:sz w:val="20"/>
           <w:szCs w:val="20"/>
         </w:rPr>
-        <w:t xml:space="preserve">Built production apps across multiple domains using Clean Architecture</w:t>
+        <w:t xml:space="preserve">Developed government apps for the Saudi Ministry of Transport, including tablet-optimized apps</w:t>
       </w:r>
     </w:p>
     <w:p>
@@ -719,7 +764,7 @@
           <w:sz w:val="21"/>
           <w:szCs w:val="21"/>
         </w:rPr>
-        <w:t xml:space="preserve"> — Takamol</w:t>
+        <w:t xml:space="preserve"> — SD Solutions</w:t>
       </w:r>
     </w:p>
     <w:p>
@@ -736,7 +781,7 @@
           <w:sz w:val="19"/>
           <w:szCs w:val="19"/>
         </w:rPr>
-        <w:t xml:space="preserve">Part-time · Feb 2022 – Jul 2023</w:t>
+        <w:t xml:space="preserve">Oct 2021 – Nov 2022</w:t>
       </w:r>
     </w:p>
     <w:p>
@@ -755,7 +800,27 @@
           <w:sz w:val="20"/>
           <w:szCs w:val="20"/>
         </w:rPr>
-        <w:t xml:space="preserve">Developed government apps for the Saudi Ministry of Transport, including tablet-optimized apps</w:t>
+        <w:t xml:space="preserve">Developed and maintained multiple mobile applications</w:t>
+      </w:r>
+    </w:p>
+    <w:p>
+      <w:pPr>
+        <w:keepNext/>
+        <w:pBdr>
+          <w:bottom w:val="single" w:color="D8DEE8" w:sz="6" w:space="2"/>
+        </w:pBdr>
+        <w:spacing w:after="80" w:before="200"/>
+      </w:pPr>
+      <w:r>
+        <w:rPr>
+          <w:rFonts w:ascii="Calibri" w:cs="Calibri" w:eastAsia="Calibri" w:hAnsi="Calibri"/>
+          <w:b/>
+          <w:bCs/>
+          <w:color w:val="0A63C2"/>
+          <w:sz w:val="21"/>
+          <w:szCs w:val="21"/>
+        </w:rPr>
+        <w:t xml:space="preserve">VENTURES</w:t>
       </w:r>
     </w:p>
     <w:p>
@@ -772,18 +837,18 @@
           <w:sz w:val="21"/>
           <w:szCs w:val="21"/>
         </w:rPr>
-        <w:t xml:space="preserve">Flutter Developer</w:t>
-      </w:r>
-      <w:r>
-        <w:rPr>
-          <w:rFonts w:ascii="Calibri" w:cs="Calibri" w:eastAsia="Calibri" w:hAnsi="Calibri"/>
-          <w:b/>
-          <w:bCs/>
-          <w:color w:val="56637A"/>
-          <w:sz w:val="21"/>
-          <w:szCs w:val="21"/>
-        </w:rPr>
-        <w:t xml:space="preserve"> — SD Solutions</w:t>
+        <w:t xml:space="preserve">Co-Founder &amp; Sole Mobile Developer</w:t>
+      </w:r>
+      <w:r>
+        <w:rPr>
+          <w:rFonts w:ascii="Calibri" w:cs="Calibri" w:eastAsia="Calibri" w:hAnsi="Calibri"/>
+          <w:b/>
+          <w:bCs/>
+          <w:color w:val="56637A"/>
+          <w:sz w:val="21"/>
+          <w:szCs w:val="21"/>
+        </w:rPr>
+        <w:t xml:space="preserve"> — Dikirnis On</w:t>
       </w:r>
     </w:p>
     <w:p>
@@ -800,7 +865,7 @@
           <w:sz w:val="19"/>
           <w:szCs w:val="19"/>
         </w:rPr>
-        <w:t xml:space="preserve">Oct 2021 – Nov 2022</w:t>
+        <w:t xml:space="preserve">Apr 2026 – Present</w:t>
       </w:r>
     </w:p>
     <w:p>
@@ -819,72 +884,7 @@
           <w:sz w:val="20"/>
           <w:szCs w:val="20"/>
         </w:rPr>
-        <w:t xml:space="preserve">Developed and maintained multiple mobile applications</w:t>
-      </w:r>
-    </w:p>
-    <w:p>
-      <w:pPr>
-        <w:keepNext/>
-        <w:pBdr>
-          <w:bottom w:val="single" w:color="D8DEE8" w:sz="6" w:space="2"/>
-        </w:pBdr>
-        <w:spacing w:after="80" w:before="200"/>
-      </w:pPr>
-      <w:r>
-        <w:rPr>
-          <w:rFonts w:ascii="Calibri" w:cs="Calibri" w:eastAsia="Calibri" w:hAnsi="Calibri"/>
-          <w:b/>
-          <w:bCs/>
-          <w:color w:val="0A63C2"/>
-          <w:sz w:val="21"/>
-          <w:szCs w:val="21"/>
-        </w:rPr>
-        <w:t xml:space="preserve">VENTURES</w:t>
-      </w:r>
-    </w:p>
-    <w:p>
-      <w:pPr>
-        <w:keepNext/>
-        <w:spacing w:after="0" w:before="90"/>
-      </w:pPr>
-      <w:r>
-        <w:rPr>
-          <w:rFonts w:ascii="Calibri" w:cs="Calibri" w:eastAsia="Calibri" w:hAnsi="Calibri"/>
-          <w:b/>
-          <w:bCs/>
-          <w:color w:val="0F1B2D"/>
-          <w:sz w:val="21"/>
-          <w:szCs w:val="21"/>
-        </w:rPr>
-        <w:t xml:space="preserve">Co-Founder &amp; Sole Mobile Developer</w:t>
-      </w:r>
-      <w:r>
-        <w:rPr>
-          <w:rFonts w:ascii="Calibri" w:cs="Calibri" w:eastAsia="Calibri" w:hAnsi="Calibri"/>
-          <w:b/>
-          <w:bCs/>
-          <w:color w:val="56637A"/>
-          <w:sz w:val="21"/>
-          <w:szCs w:val="21"/>
-        </w:rPr>
-        <w:t xml:space="preserve"> — Dikirnis On</w:t>
-      </w:r>
-    </w:p>
-    <w:p>
-      <w:pPr>
-        <w:keepNext/>
-        <w:spacing w:after="20"/>
-      </w:pPr>
-      <w:r>
-        <w:rPr>
-          <w:rFonts w:ascii="Calibri" w:cs="Calibri" w:eastAsia="Calibri" w:hAnsi="Calibri"/>
-          <w:i/>
-          <w:iCs/>
-          <w:color w:val="56637A"/>
-          <w:sz w:val="19"/>
-          <w:szCs w:val="19"/>
-        </w:rPr>
-        <w:t xml:space="preserve">Apr 2026 – Present</w:t>
+        <w:t xml:space="preserve">Co-founded a local marketplace for Dikirnis, Egypt, and independently developed its two Flutter apps (customer and merchant) covering 10+ sectors: healthcare bookings, commerce, jobs, education, home services, dining and local news</w:t>
       </w:r>
     </w:p>
     <w:p>
@@ -903,7 +903,27 @@
           <w:sz w:val="20"/>
           <w:szCs w:val="20"/>
         </w:rPr>
-        <w:t xml:space="preserve">Co-founded a local marketplace for Dikirnis, Egypt, and independently developed its two Flutter apps (customer and merchant) covering 10+ sectors: healthcare bookings, commerce, jobs, education, home services, dining and local news</w:t>
+        <w:t xml:space="preserve">Reached </w:t>
+      </w:r>
+      <w:r>
+        <w:rPr>
+          <w:rFonts w:ascii="Calibri" w:cs="Calibri" w:eastAsia="Calibri" w:hAnsi="Calibri"/>
+          <w:b/>
+          <w:bCs/>
+          <w:color w:val="0F1B2D"/>
+          <w:sz w:val="20"/>
+          <w:szCs w:val="20"/>
+        </w:rPr>
+        <w:t xml:space="preserve">2,500+ users and 500+ registered businesses</w:t>
+      </w:r>
+      <w:r>
+        <w:rPr>
+          <w:rFonts w:ascii="Calibri" w:cs="Calibri" w:eastAsia="Calibri" w:hAnsi="Calibri"/>
+          <w:color w:val="0F1B2D"/>
+          <w:sz w:val="20"/>
+          <w:szCs w:val="20"/>
+        </w:rPr>
+        <w:t xml:space="preserve"> within five months of launch in May 2026</w:t>
       </w:r>
     </w:p>
     <w:p>
@@ -922,27 +942,7 @@
           <w:sz w:val="20"/>
           <w:szCs w:val="20"/>
         </w:rPr>
-        <w:t xml:space="preserve">Grew to </w:t>
-      </w:r>
-      <w:r>
-        <w:rPr>
-          <w:rFonts w:ascii="Calibri" w:cs="Calibri" w:eastAsia="Calibri" w:hAnsi="Calibri"/>
-          <w:b/>
-          <w:bCs/>
-          <w:color w:val="0F1B2D"/>
-          <w:sz w:val="20"/>
-          <w:szCs w:val="20"/>
-        </w:rPr>
-        <w:t xml:space="preserve">2,500+ users and 500+ registered businesses</w:t>
-      </w:r>
-      <w:r>
-        <w:rPr>
-          <w:rFonts w:ascii="Calibri" w:cs="Calibri" w:eastAsia="Calibri" w:hAnsi="Calibri"/>
-          <w:color w:val="0F1B2D"/>
-          <w:sz w:val="20"/>
-          <w:szCs w:val="20"/>
-        </w:rPr>
-        <w:t xml:space="preserve"> within 5 months of the May 2026 launch</w:t>
+        <w:t xml:space="preserve">Built a server-driven UI for deeply nested categories: sectors added or reordered from the admin dashboard are reflected in the app without requiring a new mobile release</w:t>
       </w:r>
     </w:p>
     <w:p>
@@ -961,7 +961,7 @@
           <w:sz w:val="20"/>
           <w:szCs w:val="20"/>
         </w:rPr>
-        <w:t xml:space="preserve">Built a server-driven UI for deeply nested categories: sectors added or reordered from the admin dashboard are reflected in the app without requiring a new mobile release</w:t>
+        <w:t xml:space="preserve">Built merchant workflows for products and offers, orders, analytics, QR store codes, job postings and applicant messaging</w:t>
       </w:r>
     </w:p>
     <w:p>
@@ -980,25 +980,6 @@
           <w:sz w:val="20"/>
           <w:szCs w:val="20"/>
         </w:rPr>
-        <w:t xml:space="preserve">Built merchant workflows for products and offers, orders, analytics, QR store codes, job postings and applicant messaging</w:t>
-      </w:r>
-    </w:p>
-    <w:p>
-      <w:pPr>
-        <w:pStyle w:val="ListParagraph"/>
-        <w:numPr>
-          <w:ilvl w:val="0"/>
-          <w:numId w:val="2"/>
-        </w:numPr>
-        <w:spacing w:after="20"/>
-      </w:pPr>
-      <w:r>
-        <w:rPr>
-          <w:rFonts w:ascii="Calibri" w:cs="Calibri" w:eastAsia="Calibri" w:hAnsi="Calibri"/>
-          <w:color w:val="0F1B2D"/>
-          <w:sz w:val="20"/>
-          <w:szCs w:val="20"/>
-        </w:rPr>
         <w:t xml:space="preserve">Owned architecture, Flutter development (Bloc, go_router), .NET REST API integration and store releases</w:t>
       </w:r>
       <w:r>
@@ -1010,7 +991,7 @@
         </w:rPr>
         <w:t xml:space="preserve"> · </w:t>
       </w:r>
-      <w:hyperlink w:history="1" r:id="rIdhu1jwd_bwyobvmlcql2az">
+      <w:hyperlink w:history="1" r:id="rIda8hrbp0wmtepdjpmbjxom">
         <w:r>
           <w:rPr>
             <w:rFonts w:ascii="Calibri" w:cs="Calibri" w:eastAsia="Calibri" w:hAnsi="Calibri"/>
@@ -1031,7 +1012,7 @@
         </w:rPr>
         <w:t xml:space="preserve"> · </w:t>
       </w:r>
-      <w:hyperlink w:history="1" r:id="rIdsvbyzkmsisiggqhqyatq0">
+      <w:hyperlink w:history="1" r:id="rIdvxg-mzrfjgnte-e8zb8vr">
         <w:r>
           <w:rPr>
             <w:rFonts w:ascii="Calibri" w:cs="Calibri" w:eastAsia="Calibri" w:hAnsi="Calibri"/>
@@ -1162,7 +1143,7 @@
         </w:rPr>
         <w:t xml:space="preserve">Full case studies with technical decisions: </w:t>
       </w:r>
-      <w:hyperlink w:history="1" r:id="rIdqvunucxlfexka2yrub447">
+      <w:hyperlink w:history="1" r:id="rIdvqqamf4y3hiyedile_tfl">
         <w:r>
           <w:rPr>
             <w:rFonts w:ascii="Calibri" w:cs="Calibri" w:eastAsia="Calibri" w:hAnsi="Calibri"/>
@@ -1213,7 +1194,7 @@
         </w:rPr>
         <w:t xml:space="preserve"> · </w:t>
       </w:r>
-      <w:hyperlink w:history="1" r:id="rIdeedcgz70rscp2ptuqa760">
+      <w:hyperlink w:history="1" r:id="rIduvzvaeztkwotfcqi69ts8">
         <w:r>
           <w:rPr>
             <w:rFonts w:ascii="Calibri" w:cs="Calibri" w:eastAsia="Calibri" w:hAnsi="Calibri"/>
@@ -1234,7 +1215,7 @@
         </w:rPr>
         <w:t xml:space="preserve"> · </w:t>
       </w:r>
-      <w:hyperlink w:history="1" r:id="rIdhksrklqi_8m8fuk_nsu4q">
+      <w:hyperlink w:history="1" r:id="rId_nfuxgjg56ybdhpv3oa6n">
         <w:r>
           <w:rPr>
             <w:rFonts w:ascii="Calibri" w:cs="Calibri" w:eastAsia="Calibri" w:hAnsi="Calibri"/>
@@ -1302,7 +1283,7 @@
         </w:rPr>
         <w:t xml:space="preserve"> · </w:t>
       </w:r>
-      <w:hyperlink w:history="1" r:id="rId8b7lhznptaqmy9ysier61">
+      <w:hyperlink w:history="1" r:id="rId04wlwte_51xq9ttzrmv7o">
         <w:r>
           <w:rPr>
             <w:rFonts w:ascii="Calibri" w:cs="Calibri" w:eastAsia="Calibri" w:hAnsi="Calibri"/>
@@ -1323,7 +1304,7 @@
         </w:rPr>
         <w:t xml:space="preserve"> · </w:t>
       </w:r>
-      <w:hyperlink w:history="1" r:id="rIdp-zzhujgvo1mttyb2wixx">
+      <w:hyperlink w:history="1" r:id="rIdhwm4s1s2vhvbviklxuukp">
         <w:r>
           <w:rPr>
             <w:rFonts w:ascii="Calibri" w:cs="Calibri" w:eastAsia="Calibri" w:hAnsi="Calibri"/>
@@ -1391,7 +1372,7 @@
         </w:rPr>
         <w:t xml:space="preserve"> · </w:t>
       </w:r>
-      <w:hyperlink w:history="1" r:id="rIdlno1ammivrs_24cg29lxl">
+      <w:hyperlink w:history="1" r:id="rIdqx9jk2c3ytkx0tpr6edpk">
         <w:r>
           <w:rPr>
             <w:rFonts w:ascii="Calibri" w:cs="Calibri" w:eastAsia="Calibri" w:hAnsi="Calibri"/>
@@ -1412,7 +1393,7 @@
         </w:rPr>
         <w:t xml:space="preserve"> · </w:t>
       </w:r>
-      <w:hyperlink w:history="1" r:id="rIdcb1otensam-ko4cvi_7yr">
+      <w:hyperlink w:history="1" r:id="rIdmjbyp2vxf6zgtiqi-msxb">
         <w:r>
           <w:rPr>
             <w:rFonts w:ascii="Calibri" w:cs="Calibri" w:eastAsia="Calibri" w:hAnsi="Calibri"/>
@@ -1538,7 +1519,7 @@
         </w:rPr>
         <w:t xml:space="preserve"> · </w:t>
       </w:r>
-      <w:hyperlink w:history="1" r:id="rIdn8is0j0s1kzt3guo6myq5">
+      <w:hyperlink w:history="1" r:id="rIdzjxeswxpzj1pdipyfuc0l">
         <w:r>
           <w:rPr>
             <w:rFonts w:ascii="Calibri" w:cs="Calibri" w:eastAsia="Calibri" w:hAnsi="Calibri"/>
@@ -1559,7 +1540,7 @@
         </w:rPr>
         <w:t xml:space="preserve"> · </w:t>
       </w:r>
-      <w:hyperlink w:history="1" r:id="rIdulvzze9julj7xppppm2hi">
+      <w:hyperlink w:history="1" r:id="rIdxbag6-1c3iygezk4qt6je">
         <w:r>
           <w:rPr>
             <w:rFonts w:ascii="Calibri" w:cs="Calibri" w:eastAsia="Calibri" w:hAnsi="Calibri"/>
@@ -1627,7 +1608,7 @@
         </w:rPr>
         <w:t xml:space="preserve"> · </w:t>
       </w:r>
-      <w:hyperlink w:history="1" r:id="rIdp3fasamixl7qfi2f1dgg4">
+      <w:hyperlink w:history="1" r:id="rIdnhxqz7wtvb_hjiqp68lzq">
         <w:r>
           <w:rPr>
             <w:rFonts w:ascii="Calibri" w:cs="Calibri" w:eastAsia="Calibri" w:hAnsi="Calibri"/>
@@ -1648,7 +1629,7 @@
         </w:rPr>
         <w:t xml:space="preserve"> · </w:t>
       </w:r>
-      <w:hyperlink w:history="1" r:id="rId-p4hu_jj8_f62wxlccixf">
+      <w:hyperlink w:history="1" r:id="rId5uieblzngy6j8_zcilwmg">
         <w:r>
           <w:rPr>
             <w:rFonts w:ascii="Calibri" w:cs="Calibri" w:eastAsia="Calibri" w:hAnsi="Calibri"/>
@@ -1677,7 +1658,7 @@
           <w:sz w:val="20"/>
           <w:szCs w:val="20"/>
         </w:rPr>
-        <w:t xml:space="preserve">Prayer times with Adhan notifications, Tajweed Mushaf, Quran audio by multiple reciters, memorization with spaced review; free and ad-free</w:t>
+        <w:t xml:space="preserve">Prayer times with Adhan notifications, Tajweed Mushaf, Quran audio and memorization tools; free and ad-free</w:t>
       </w:r>
     </w:p>
     <w:p>
@@ -1716,7 +1697,7 @@
         </w:rPr>
         <w:t xml:space="preserve"> · </w:t>
       </w:r>
-      <w:hyperlink w:history="1" r:id="rIdgintn3aljtz2gmdplyz2d">
+      <w:hyperlink w:history="1" r:id="rIdk81ncdh1appshtpazi21e">
         <w:r>
           <w:rPr>
             <w:rFonts w:ascii="Calibri" w:cs="Calibri" w:eastAsia="Calibri" w:hAnsi="Calibri"/>
@@ -1737,7 +1718,7 @@
         </w:rPr>
         <w:t xml:space="preserve"> · </w:t>
       </w:r>
-      <w:hyperlink w:history="1" r:id="rIdrabwwvcuvxt1ffzmtgftn">
+      <w:hyperlink w:history="1" r:id="rIdxm1ety_uqbj9zgzohi3xu">
         <w:r>
           <w:rPr>
             <w:rFonts w:ascii="Calibri" w:cs="Calibri" w:eastAsia="Calibri" w:hAnsi="Calibri"/>
@@ -2620,7 +2601,7 @@
     </w:p>
     <w:p>
       <w:pPr>
-        <w:spacing w:after="20"/>
+        <w:spacing w:after="0"/>
       </w:pPr>
       <w:r>
         <w:rPr>
@@ -2640,27 +2621,33 @@
           <w:sz w:val="20"/>
           <w:szCs w:val="20"/>
         </w:rPr>
-        <w:t xml:space="preserve"> — Mansoura University, 2015 – 2019</w:t>
-      </w:r>
-    </w:p>
-    <w:p>
-      <w:pPr>
-        <w:spacing w:after="0"/>
-      </w:pPr>
-      <w:r>
-        <w:rPr>
-          <w:rFonts w:ascii="Calibri" w:cs="Calibri" w:eastAsia="Calibri" w:hAnsi="Calibri"/>
-          <w:color w:val="0F1B2D"/>
-          <w:sz w:val="20"/>
-          <w:szCs w:val="20"/>
-        </w:rPr>
-        <w:t xml:space="preserve">Arabic (native) · English (professional working proficiency)</w:t>
+        <w:t xml:space="preserve"> — Mansoura University, 2015 – 2019 · </w:t>
+      </w:r>
+      <w:r>
+        <w:rPr>
+          <w:rFonts w:ascii="Calibri" w:cs="Calibri" w:eastAsia="Calibri" w:hAnsi="Calibri"/>
+          <w:b/>
+          <w:bCs/>
+          <w:color w:val="0F1B2D"/>
+          <w:sz w:val="20"/>
+          <w:szCs w:val="20"/>
+        </w:rPr>
+        <w:t xml:space="preserve">Languages:</w:t>
+      </w:r>
+      <w:r>
+        <w:rPr>
+          <w:rFonts w:ascii="Calibri" w:cs="Calibri" w:eastAsia="Calibri" w:hAnsi="Calibri"/>
+          <w:color w:val="0F1B2D"/>
+          <w:sz w:val="20"/>
+          <w:szCs w:val="20"/>
+        </w:rPr>
+        <w:t xml:space="preserve"> Arabic (native), English (professional working proficiency)</w:t>
       </w:r>
     </w:p>
     <w:sectPr>
       <w:footerReference w:type="default" r:id="rId7"/>
       <w:pgSz w:w="11906" w:h="16838" w:orient="portrait"/>
-      <w:pgMar w:top="850" w:right="1020" w:bottom="900" w:left="1020" w:header="708" w:footer="708" w:gutter="0"/>
+      <w:pgMar w:top="720" w:right="1020" w:bottom="760" w:left="1020" w:header="708" w:footer="708" w:gutter="0"/>
       <w:pgNumType/>
       <w:docGrid w:linePitch="360"/>
     </w:sectPr>
@@ -2895,7 +2882,7 @@
     </w:rPrDefault>
     <w:pPrDefault>
       <w:pPr>
-        <w:spacing w:line="264"/>
+        <w:spacing w:line="252"/>
       </w:pPr>
     </w:pPrDefault>
   </w:docDefaults>

</xml_diff>

<commit_message>
CV: add RepoSphere to Key Projects
Co-Authored-By: Claude Opus 5.5 <noreply@anthropic.com>
Claude-Session: https://claude.ai/code/session_01CsdgqbKDbfLszR8uS2ZC79
</commit_message>
<xml_diff>
--- a/Atef_Elsaeed_CV.docx
+++ b/Atef_Elsaeed_CV.docx
@@ -74,7 +74,7 @@
         </w:rPr>
         <w:t xml:space="preserve"> · </w:t>
       </w:r>
-      <w:hyperlink w:history="1" r:id="rId0vj2n4umzz12wolo9uo97">
+      <w:hyperlink w:history="1" r:id="rIdutyohnzctorcemrs2gwsh">
         <w:r>
           <w:rPr>
             <w:rFonts w:ascii="Calibri" w:cs="Calibri" w:eastAsia="Calibri" w:hAnsi="Calibri"/>
@@ -102,7 +102,7 @@
         </w:rPr>
         <w:t xml:space="preserve">Portfolio: </w:t>
       </w:r>
-      <w:hyperlink w:history="1" r:id="rIdjkrmfpigwufbtldatl7la">
+      <w:hyperlink w:history="1" r:id="rIdh_-dennn1ddxibuv19ygl">
         <w:r>
           <w:rPr>
             <w:rFonts w:ascii="Calibri" w:cs="Calibri" w:eastAsia="Calibri" w:hAnsi="Calibri"/>
@@ -130,7 +130,7 @@
       <w:pPr>
         <w:spacing w:after="60"/>
       </w:pPr>
-      <w:hyperlink w:history="1" r:id="rIdcdukapus1rxregkpwcgw5">
+      <w:hyperlink w:history="1" r:id="rIdibrjs2xzo6hxraktuxb0o">
         <w:r>
           <w:rPr>
             <w:rFonts w:ascii="Calibri" w:cs="Calibri" w:eastAsia="Calibri" w:hAnsi="Calibri"/>
@@ -151,7 +151,7 @@
         </w:rPr>
         <w:t xml:space="preserve"> · </w:t>
       </w:r>
-      <w:hyperlink w:history="1" r:id="rIdxs5lthp524mio2ugc0beo">
+      <w:hyperlink w:history="1" r:id="rId1rynq4yxlocngljn3pe-n">
         <w:r>
           <w:rPr>
             <w:rFonts w:ascii="Calibri" w:cs="Calibri" w:eastAsia="Calibri" w:hAnsi="Calibri"/>
@@ -172,7 +172,7 @@
         </w:rPr>
         <w:t xml:space="preserve"> · </w:t>
       </w:r>
-      <w:hyperlink w:history="1" r:id="rIdp8njm6ztgw9svn_ulx2zx">
+      <w:hyperlink w:history="1" r:id="rIdnk3x02vf7jv0o81iicpry">
         <w:r>
           <w:rPr>
             <w:rFonts w:ascii="Calibri" w:cs="Calibri" w:eastAsia="Calibri" w:hAnsi="Calibri"/>
@@ -193,7 +193,7 @@
         </w:rPr>
         <w:t xml:space="preserve"> · </w:t>
       </w:r>
-      <w:hyperlink w:history="1" r:id="rIddgb78_cuq1sresngnzxkh">
+      <w:hyperlink w:history="1" r:id="rIdractqerpdy3shhfsqupd7">
         <w:r>
           <w:rPr>
             <w:rFonts w:ascii="Calibri" w:cs="Calibri" w:eastAsia="Calibri" w:hAnsi="Calibri"/>
@@ -991,7 +991,7 @@
         </w:rPr>
         <w:t xml:space="preserve"> · </w:t>
       </w:r>
-      <w:hyperlink w:history="1" r:id="rIda8hrbp0wmtepdjpmbjxom">
+      <w:hyperlink w:history="1" r:id="rIdmls1qrfyjlwufdm2zqywj">
         <w:r>
           <w:rPr>
             <w:rFonts w:ascii="Calibri" w:cs="Calibri" w:eastAsia="Calibri" w:hAnsi="Calibri"/>
@@ -1012,7 +1012,7 @@
         </w:rPr>
         <w:t xml:space="preserve"> · </w:t>
       </w:r>
-      <w:hyperlink w:history="1" r:id="rIdvxg-mzrfjgnte-e8zb8vr">
+      <w:hyperlink w:history="1" r:id="rIdz-uxnzlb-w6uoo4jbe_uz">
         <w:r>
           <w:rPr>
             <w:rFonts w:ascii="Calibri" w:cs="Calibri" w:eastAsia="Calibri" w:hAnsi="Calibri"/>
@@ -1143,7 +1143,7 @@
         </w:rPr>
         <w:t xml:space="preserve">Full case studies with technical decisions: </w:t>
       </w:r>
-      <w:hyperlink w:history="1" r:id="rIdvqqamf4y3hiyedile_tfl">
+      <w:hyperlink w:history="1" r:id="rIdp-zdv7pofa29ggzfxw7-k">
         <w:r>
           <w:rPr>
             <w:rFonts w:ascii="Calibri" w:cs="Calibri" w:eastAsia="Calibri" w:hAnsi="Calibri"/>
@@ -1194,7 +1194,7 @@
         </w:rPr>
         <w:t xml:space="preserve"> · </w:t>
       </w:r>
-      <w:hyperlink w:history="1" r:id="rIduvzvaeztkwotfcqi69ts8">
+      <w:hyperlink w:history="1" r:id="rIdurpmucjw32hise-n0ddsy">
         <w:r>
           <w:rPr>
             <w:rFonts w:ascii="Calibri" w:cs="Calibri" w:eastAsia="Calibri" w:hAnsi="Calibri"/>
@@ -1215,7 +1215,7 @@
         </w:rPr>
         <w:t xml:space="preserve"> · </w:t>
       </w:r>
-      <w:hyperlink w:history="1" r:id="rId_nfuxgjg56ybdhpv3oa6n">
+      <w:hyperlink w:history="1" r:id="rIdsciyjodsiyiv-7odli6co">
         <w:r>
           <w:rPr>
             <w:rFonts w:ascii="Calibri" w:cs="Calibri" w:eastAsia="Calibri" w:hAnsi="Calibri"/>
@@ -1283,7 +1283,7 @@
         </w:rPr>
         <w:t xml:space="preserve"> · </w:t>
       </w:r>
-      <w:hyperlink w:history="1" r:id="rId04wlwte_51xq9ttzrmv7o">
+      <w:hyperlink w:history="1" r:id="rIdf5io_q6gzqrm93_kb-ukx">
         <w:r>
           <w:rPr>
             <w:rFonts w:ascii="Calibri" w:cs="Calibri" w:eastAsia="Calibri" w:hAnsi="Calibri"/>
@@ -1304,7 +1304,7 @@
         </w:rPr>
         <w:t xml:space="preserve"> · </w:t>
       </w:r>
-      <w:hyperlink w:history="1" r:id="rIdhwm4s1s2vhvbviklxuukp">
+      <w:hyperlink w:history="1" r:id="rIdbmfsmrdyr0ryxwy0jnt7-">
         <w:r>
           <w:rPr>
             <w:rFonts w:ascii="Calibri" w:cs="Calibri" w:eastAsia="Calibri" w:hAnsi="Calibri"/>
@@ -1372,7 +1372,7 @@
         </w:rPr>
         <w:t xml:space="preserve"> · </w:t>
       </w:r>
-      <w:hyperlink w:history="1" r:id="rIdqx9jk2c3ytkx0tpr6edpk">
+      <w:hyperlink w:history="1" r:id="rIdruu9rphcqi5yfdmez5lkg">
         <w:r>
           <w:rPr>
             <w:rFonts w:ascii="Calibri" w:cs="Calibri" w:eastAsia="Calibri" w:hAnsi="Calibri"/>
@@ -1393,7 +1393,7 @@
         </w:rPr>
         <w:t xml:space="preserve"> · </w:t>
       </w:r>
-      <w:hyperlink w:history="1" r:id="rIdmjbyp2vxf6zgtiqi-msxb">
+      <w:hyperlink w:history="1" r:id="rIdxfkrtsh--kq4l5iq0ndnt">
         <w:r>
           <w:rPr>
             <w:rFonts w:ascii="Calibri" w:cs="Calibri" w:eastAsia="Calibri" w:hAnsi="Calibri"/>
@@ -1497,6 +1497,93 @@
           <w:sz w:val="21"/>
           <w:szCs w:val="21"/>
         </w:rPr>
+        <w:t xml:space="preserve">RepoSphere</w:t>
+      </w:r>
+      <w:r>
+        <w:rPr>
+          <w:rFonts w:ascii="Calibri" w:cs="Calibri" w:eastAsia="Calibri" w:hAnsi="Calibri"/>
+          <w:b/>
+          <w:bCs/>
+          <w:color w:val="56637A"/>
+          <w:sz w:val="21"/>
+          <w:szCs w:val="21"/>
+        </w:rPr>
+        <w:t xml:space="preserve"> — Open-source developer dashboard</w:t>
+      </w:r>
+      <w:r>
+        <w:rPr>
+          <w:rFonts w:ascii="Calibri" w:cs="Calibri" w:eastAsia="Calibri" w:hAnsi="Calibri"/>
+          <w:color w:val="56637A"/>
+          <w:sz w:val="19"/>
+          <w:szCs w:val="19"/>
+        </w:rPr>
+        <w:t xml:space="preserve"> · </w:t>
+      </w:r>
+      <w:hyperlink w:history="1" r:id="rIdjgvlymeyj2bmgsrci-gc_">
+        <w:r>
+          <w:rPr>
+            <w:rFonts w:ascii="Calibri" w:cs="Calibri" w:eastAsia="Calibri" w:hAnsi="Calibri"/>
+            <w:color w:val="0A63C2"/>
+            <w:sz w:val="19"/>
+            <w:szCs w:val="19"/>
+            <w:u w:val="single"/>
+          </w:rPr>
+          <w:t xml:space="preserve">GitHub</w:t>
+        </w:r>
+      </w:hyperlink>
+    </w:p>
+    <w:p>
+      <w:pPr>
+        <w:pStyle w:val="ListParagraph"/>
+        <w:numPr>
+          <w:ilvl w:val="0"/>
+          <w:numId w:val="2"/>
+        </w:numPr>
+        <w:spacing w:after="20"/>
+      </w:pPr>
+      <w:r>
+        <w:rPr>
+          <w:rFonts w:ascii="Calibri" w:cs="Calibri" w:eastAsia="Calibri" w:hAnsi="Calibri"/>
+          <w:color w:val="0F1B2D"/>
+          <w:sz w:val="20"/>
+          <w:szCs w:val="20"/>
+        </w:rPr>
+        <w:t xml:space="preserve">Flutter app (web-first, multi-platform) that unifies repos, PRs, issues and notifications from GitHub and GitLab in one dashboard</w:t>
+      </w:r>
+    </w:p>
+    <w:p>
+      <w:pPr>
+        <w:pStyle w:val="ListParagraph"/>
+        <w:numPr>
+          <w:ilvl w:val="0"/>
+          <w:numId w:val="2"/>
+        </w:numPr>
+        <w:spacing w:after="20"/>
+      </w:pPr>
+      <w:r>
+        <w:rPr>
+          <w:rFonts w:ascii="Calibri" w:cs="Calibri" w:eastAsia="Calibri" w:hAnsi="Calibri"/>
+          <w:color w:val="0F1B2D"/>
+          <w:sz w:val="20"/>
+          <w:szCs w:val="20"/>
+        </w:rPr>
+        <w:t xml:space="preserve">Clean Architecture with Riverpod and GoRouter, OAuth Device Flow, secure token storage, and CI running analysis, tests and web builds</w:t>
+      </w:r>
+    </w:p>
+    <w:p>
+      <w:pPr>
+        <w:keepNext/>
+        <w:spacing w:after="20" w:before="90"/>
+      </w:pPr>
+      <w:r>
+        <w:rPr>
+          <w:rFonts w:ascii="Calibri" w:cs="Calibri" w:eastAsia="Calibri" w:hAnsi="Calibri"/>
+          <w:b/>
+          <w:bCs/>
+          <w:color w:val="0F1B2D"/>
+          <w:sz w:val="21"/>
+          <w:szCs w:val="21"/>
+        </w:rPr>
         <w:t xml:space="preserve">Dhahirah Governorate Portal</w:t>
       </w:r>
       <w:r>
@@ -1519,7 +1606,7 @@
         </w:rPr>
         <w:t xml:space="preserve"> · </w:t>
       </w:r>
-      <w:hyperlink w:history="1" r:id="rIdzjxeswxpzj1pdipyfuc0l">
+      <w:hyperlink w:history="1" r:id="rIddxtgsdbi07bpdiqyymctf">
         <w:r>
           <w:rPr>
             <w:rFonts w:ascii="Calibri" w:cs="Calibri" w:eastAsia="Calibri" w:hAnsi="Calibri"/>
@@ -1540,7 +1627,7 @@
         </w:rPr>
         <w:t xml:space="preserve"> · </w:t>
       </w:r>
-      <w:hyperlink w:history="1" r:id="rIdxbag6-1c3iygezk4qt6je">
+      <w:hyperlink w:history="1" r:id="rIdhsafr30jvcomc4ojdmtsc">
         <w:r>
           <w:rPr>
             <w:rFonts w:ascii="Calibri" w:cs="Calibri" w:eastAsia="Calibri" w:hAnsi="Calibri"/>
@@ -1608,7 +1695,7 @@
         </w:rPr>
         <w:t xml:space="preserve"> · </w:t>
       </w:r>
-      <w:hyperlink w:history="1" r:id="rIdnhxqz7wtvb_hjiqp68lzq">
+      <w:hyperlink w:history="1" r:id="rIdmhzp0jpghzwdzs8hzj774">
         <w:r>
           <w:rPr>
             <w:rFonts w:ascii="Calibri" w:cs="Calibri" w:eastAsia="Calibri" w:hAnsi="Calibri"/>
@@ -1629,7 +1716,7 @@
         </w:rPr>
         <w:t xml:space="preserve"> · </w:t>
       </w:r>
-      <w:hyperlink w:history="1" r:id="rId5uieblzngy6j8_zcilwmg">
+      <w:hyperlink w:history="1" r:id="rIdbxdnep1vbznyekgczaz7p">
         <w:r>
           <w:rPr>
             <w:rFonts w:ascii="Calibri" w:cs="Calibri" w:eastAsia="Calibri" w:hAnsi="Calibri"/>
@@ -1697,7 +1784,7 @@
         </w:rPr>
         <w:t xml:space="preserve"> · </w:t>
       </w:r>
-      <w:hyperlink w:history="1" r:id="rIdk81ncdh1appshtpazi21e">
+      <w:hyperlink w:history="1" r:id="rId5te6kzc705a0llykn5ule">
         <w:r>
           <w:rPr>
             <w:rFonts w:ascii="Calibri" w:cs="Calibri" w:eastAsia="Calibri" w:hAnsi="Calibri"/>
@@ -1718,7 +1805,7 @@
         </w:rPr>
         <w:t xml:space="preserve"> · </w:t>
       </w:r>
-      <w:hyperlink w:history="1" r:id="rIdxm1ety_uqbj9zgzohi3xu">
+      <w:hyperlink w:history="1" r:id="rIdbizm8rbylqzcgsvyah86b">
         <w:r>
           <w:rPr>
             <w:rFonts w:ascii="Calibri" w:cs="Calibri" w:eastAsia="Calibri" w:hAnsi="Calibri"/>

</xml_diff>

<commit_message>
Link the RepoSphere live demo from the site and CV
Co-Authored-By: Claude Opus 5.5 <noreply@anthropic.com>
Claude-Session: https://claude.ai/code/session_01CsdgqbKDbfLszR8uS2ZC79
</commit_message>
<xml_diff>
--- a/Atef_Elsaeed_CV.docx
+++ b/Atef_Elsaeed_CV.docx
@@ -74,7 +74,7 @@
         </w:rPr>
         <w:t xml:space="preserve"> · </w:t>
       </w:r>
-      <w:hyperlink w:history="1" r:id="rIdutyohnzctorcemrs2gwsh">
+      <w:hyperlink w:history="1" r:id="rIdcigu_l3fq50ljylmyknpr">
         <w:r>
           <w:rPr>
             <w:rFonts w:ascii="Calibri" w:cs="Calibri" w:eastAsia="Calibri" w:hAnsi="Calibri"/>
@@ -102,7 +102,7 @@
         </w:rPr>
         <w:t xml:space="preserve">Portfolio: </w:t>
       </w:r>
-      <w:hyperlink w:history="1" r:id="rIdh_-dennn1ddxibuv19ygl">
+      <w:hyperlink w:history="1" r:id="rIdsnkzvulm-georzeu4e-a2">
         <w:r>
           <w:rPr>
             <w:rFonts w:ascii="Calibri" w:cs="Calibri" w:eastAsia="Calibri" w:hAnsi="Calibri"/>
@@ -130,7 +130,7 @@
       <w:pPr>
         <w:spacing w:after="60"/>
       </w:pPr>
-      <w:hyperlink w:history="1" r:id="rIdibrjs2xzo6hxraktuxb0o">
+      <w:hyperlink w:history="1" r:id="rId8fhlhuwwk41ipl58gdsbz">
         <w:r>
           <w:rPr>
             <w:rFonts w:ascii="Calibri" w:cs="Calibri" w:eastAsia="Calibri" w:hAnsi="Calibri"/>
@@ -151,7 +151,7 @@
         </w:rPr>
         <w:t xml:space="preserve"> · </w:t>
       </w:r>
-      <w:hyperlink w:history="1" r:id="rId1rynq4yxlocngljn3pe-n">
+      <w:hyperlink w:history="1" r:id="rIdymibbbsqygsvfzs64wzs7">
         <w:r>
           <w:rPr>
             <w:rFonts w:ascii="Calibri" w:cs="Calibri" w:eastAsia="Calibri" w:hAnsi="Calibri"/>
@@ -172,7 +172,7 @@
         </w:rPr>
         <w:t xml:space="preserve"> · </w:t>
       </w:r>
-      <w:hyperlink w:history="1" r:id="rIdnk3x02vf7jv0o81iicpry">
+      <w:hyperlink w:history="1" r:id="rId-tmaqe7pn4nqnt87rmy9i">
         <w:r>
           <w:rPr>
             <w:rFonts w:ascii="Calibri" w:cs="Calibri" w:eastAsia="Calibri" w:hAnsi="Calibri"/>
@@ -193,7 +193,7 @@
         </w:rPr>
         <w:t xml:space="preserve"> · </w:t>
       </w:r>
-      <w:hyperlink w:history="1" r:id="rIdractqerpdy3shhfsqupd7">
+      <w:hyperlink w:history="1" r:id="rId2cx7d0ma-bu54oyg3wr29">
         <w:r>
           <w:rPr>
             <w:rFonts w:ascii="Calibri" w:cs="Calibri" w:eastAsia="Calibri" w:hAnsi="Calibri"/>
@@ -991,7 +991,7 @@
         </w:rPr>
         <w:t xml:space="preserve"> · </w:t>
       </w:r>
-      <w:hyperlink w:history="1" r:id="rIdmls1qrfyjlwufdm2zqywj">
+      <w:hyperlink w:history="1" r:id="rIds1xi1-pratxca5zhagxyn">
         <w:r>
           <w:rPr>
             <w:rFonts w:ascii="Calibri" w:cs="Calibri" w:eastAsia="Calibri" w:hAnsi="Calibri"/>
@@ -1012,7 +1012,7 @@
         </w:rPr>
         <w:t xml:space="preserve"> · </w:t>
       </w:r>
-      <w:hyperlink w:history="1" r:id="rIdz-uxnzlb-w6uoo4jbe_uz">
+      <w:hyperlink w:history="1" r:id="rId2qx5bx_r_bdaay13kurzi">
         <w:r>
           <w:rPr>
             <w:rFonts w:ascii="Calibri" w:cs="Calibri" w:eastAsia="Calibri" w:hAnsi="Calibri"/>
@@ -1143,7 +1143,7 @@
         </w:rPr>
         <w:t xml:space="preserve">Full case studies with technical decisions: </w:t>
       </w:r>
-      <w:hyperlink w:history="1" r:id="rIdp-zdv7pofa29ggzfxw7-k">
+      <w:hyperlink w:history="1" r:id="rId03bzt8houglfoq_82xiqw">
         <w:r>
           <w:rPr>
             <w:rFonts w:ascii="Calibri" w:cs="Calibri" w:eastAsia="Calibri" w:hAnsi="Calibri"/>
@@ -1194,7 +1194,7 @@
         </w:rPr>
         <w:t xml:space="preserve"> · </w:t>
       </w:r>
-      <w:hyperlink w:history="1" r:id="rIdurpmucjw32hise-n0ddsy">
+      <w:hyperlink w:history="1" r:id="rIdocfu1g36mj-7_lwl5hype">
         <w:r>
           <w:rPr>
             <w:rFonts w:ascii="Calibri" w:cs="Calibri" w:eastAsia="Calibri" w:hAnsi="Calibri"/>
@@ -1215,7 +1215,7 @@
         </w:rPr>
         <w:t xml:space="preserve"> · </w:t>
       </w:r>
-      <w:hyperlink w:history="1" r:id="rIdsciyjodsiyiv-7odli6co">
+      <w:hyperlink w:history="1" r:id="rId1rcqntpir5rysgcogcz72">
         <w:r>
           <w:rPr>
             <w:rFonts w:ascii="Calibri" w:cs="Calibri" w:eastAsia="Calibri" w:hAnsi="Calibri"/>
@@ -1283,7 +1283,7 @@
         </w:rPr>
         <w:t xml:space="preserve"> · </w:t>
       </w:r>
-      <w:hyperlink w:history="1" r:id="rIdf5io_q6gzqrm93_kb-ukx">
+      <w:hyperlink w:history="1" r:id="rIdnqx90etf1p8jdfffwxr5j">
         <w:r>
           <w:rPr>
             <w:rFonts w:ascii="Calibri" w:cs="Calibri" w:eastAsia="Calibri" w:hAnsi="Calibri"/>
@@ -1304,7 +1304,7 @@
         </w:rPr>
         <w:t xml:space="preserve"> · </w:t>
       </w:r>
-      <w:hyperlink w:history="1" r:id="rIdbmfsmrdyr0ryxwy0jnt7-">
+      <w:hyperlink w:history="1" r:id="rIdt_px_czfrm5mb8dsn7njl">
         <w:r>
           <w:rPr>
             <w:rFonts w:ascii="Calibri" w:cs="Calibri" w:eastAsia="Calibri" w:hAnsi="Calibri"/>
@@ -1372,7 +1372,7 @@
         </w:rPr>
         <w:t xml:space="preserve"> · </w:t>
       </w:r>
-      <w:hyperlink w:history="1" r:id="rIdruu9rphcqi5yfdmez5lkg">
+      <w:hyperlink w:history="1" r:id="rId-zwhcsnenui_1cgogur-n">
         <w:r>
           <w:rPr>
             <w:rFonts w:ascii="Calibri" w:cs="Calibri" w:eastAsia="Calibri" w:hAnsi="Calibri"/>
@@ -1393,7 +1393,7 @@
         </w:rPr>
         <w:t xml:space="preserve"> · </w:t>
       </w:r>
-      <w:hyperlink w:history="1" r:id="rIdxfkrtsh--kq4l5iq0ndnt">
+      <w:hyperlink w:history="1" r:id="rId8bc5a2hwneqesnhk371gf">
         <w:r>
           <w:rPr>
             <w:rFonts w:ascii="Calibri" w:cs="Calibri" w:eastAsia="Calibri" w:hAnsi="Calibri"/>
@@ -1519,7 +1519,28 @@
         </w:rPr>
         <w:t xml:space="preserve"> · </w:t>
       </w:r>
-      <w:hyperlink w:history="1" r:id="rIdjgvlymeyj2bmgsrci-gc_">
+      <w:hyperlink w:history="1" r:id="rId4buz8rwxewslhj9ftfp4w">
+        <w:r>
+          <w:rPr>
+            <w:rFonts w:ascii="Calibri" w:cs="Calibri" w:eastAsia="Calibri" w:hAnsi="Calibri"/>
+            <w:color w:val="0A63C2"/>
+            <w:sz w:val="19"/>
+            <w:szCs w:val="19"/>
+            <w:u w:val="single"/>
+          </w:rPr>
+          <w:t xml:space="preserve">Live demo</w:t>
+        </w:r>
+      </w:hyperlink>
+      <w:r>
+        <w:rPr>
+          <w:rFonts w:ascii="Calibri" w:cs="Calibri" w:eastAsia="Calibri" w:hAnsi="Calibri"/>
+          <w:color w:val="56637A"/>
+          <w:sz w:val="19"/>
+          <w:szCs w:val="19"/>
+        </w:rPr>
+        <w:t xml:space="preserve"> · </w:t>
+      </w:r>
+      <w:hyperlink w:history="1" r:id="rIdpqeafopmlmgnxggj7lmyj">
         <w:r>
           <w:rPr>
             <w:rFonts w:ascii="Calibri" w:cs="Calibri" w:eastAsia="Calibri" w:hAnsi="Calibri"/>
@@ -1606,7 +1627,7 @@
         </w:rPr>
         <w:t xml:space="preserve"> · </w:t>
       </w:r>
-      <w:hyperlink w:history="1" r:id="rIddxtgsdbi07bpdiqyymctf">
+      <w:hyperlink w:history="1" r:id="rIdkijv1v_xrgl9fuazenybf">
         <w:r>
           <w:rPr>
             <w:rFonts w:ascii="Calibri" w:cs="Calibri" w:eastAsia="Calibri" w:hAnsi="Calibri"/>
@@ -1627,7 +1648,7 @@
         </w:rPr>
         <w:t xml:space="preserve"> · </w:t>
       </w:r>
-      <w:hyperlink w:history="1" r:id="rIdhsafr30jvcomc4ojdmtsc">
+      <w:hyperlink w:history="1" r:id="rIdea5rb-qmqfmhtdlfwfwqy">
         <w:r>
           <w:rPr>
             <w:rFonts w:ascii="Calibri" w:cs="Calibri" w:eastAsia="Calibri" w:hAnsi="Calibri"/>
@@ -1695,7 +1716,7 @@
         </w:rPr>
         <w:t xml:space="preserve"> · </w:t>
       </w:r>
-      <w:hyperlink w:history="1" r:id="rIdmhzp0jpghzwdzs8hzj774">
+      <w:hyperlink w:history="1" r:id="rIdgikeuniwueir04djla03i">
         <w:r>
           <w:rPr>
             <w:rFonts w:ascii="Calibri" w:cs="Calibri" w:eastAsia="Calibri" w:hAnsi="Calibri"/>
@@ -1716,7 +1737,7 @@
         </w:rPr>
         <w:t xml:space="preserve"> · </w:t>
       </w:r>
-      <w:hyperlink w:history="1" r:id="rIdbxdnep1vbznyekgczaz7p">
+      <w:hyperlink w:history="1" r:id="rIdjwqkawadlowgmt_5hlnoe">
         <w:r>
           <w:rPr>
             <w:rFonts w:ascii="Calibri" w:cs="Calibri" w:eastAsia="Calibri" w:hAnsi="Calibri"/>
@@ -1784,7 +1805,7 @@
         </w:rPr>
         <w:t xml:space="preserve"> · </w:t>
       </w:r>
-      <w:hyperlink w:history="1" r:id="rId5te6kzc705a0llykn5ule">
+      <w:hyperlink w:history="1" r:id="rIdmpg84xdpx40vpplg8zbx5">
         <w:r>
           <w:rPr>
             <w:rFonts w:ascii="Calibri" w:cs="Calibri" w:eastAsia="Calibri" w:hAnsi="Calibri"/>
@@ -1805,7 +1826,7 @@
         </w:rPr>
         <w:t xml:space="preserve"> · </w:t>
       </w:r>
-      <w:hyperlink w:history="1" r:id="rIdbizm8rbylqzcgsvyah86b">
+      <w:hyperlink w:history="1" r:id="rIdj3yzqjasnp14m8izhgiau">
         <w:r>
           <w:rPr>
             <w:rFonts w:ascii="Calibri" w:cs="Calibri" w:eastAsia="Calibri" w:hAnsi="Calibri"/>

</xml_diff>